<commit_message>
Modified for new project 5.
</commit_message>
<xml_diff>
--- a/projects/project01.docx
+++ b/projects/project01.docx
@@ -137,6 +137,7 @@
       <w:r>
         <w:t xml:space="preserve"> and a </w:t>
       </w:r>
+      <w:proofErr w:type="gramStart"/>
       <w:r>
         <w:t>2000</w:t>
       </w:r>
@@ -144,7 +145,11 @@
         <w:t xml:space="preserve"> </w:t>
       </w:r>
       <w:r>
-        <w:t xml:space="preserve">word </w:t>
+        <w:t>word</w:t>
+      </w:r>
+      <w:proofErr w:type="gramEnd"/>
+      <w:r>
+        <w:t xml:space="preserve"> </w:t>
       </w:r>
       <w:r>
         <w:t>Google</w:t>
@@ -178,7 +183,23 @@
         <w:t xml:space="preserve"> Google Slides presentation </w:t>
       </w:r>
       <w:r>
-        <w:t>due by your assigned day and a 1500 words Google document (talk to professor on what can be trimmed)</w:t>
+        <w:t xml:space="preserve">due </w:t>
+      </w:r>
+      <w:proofErr w:type="gramStart"/>
+      <w:r>
+        <w:t>by</w:t>
+      </w:r>
+      <w:proofErr w:type="gramEnd"/>
+      <w:r>
+        <w:t xml:space="preserve"> your assigned day and a </w:t>
+      </w:r>
+      <w:proofErr w:type="gramStart"/>
+      <w:r>
+        <w:t>1500 words</w:t>
+      </w:r>
+      <w:proofErr w:type="gramEnd"/>
+      <w:r>
+        <w:t xml:space="preserve"> Google document (talk to professor on what can be trimmed)</w:t>
       </w:r>
     </w:p>
     <w:p>
@@ -224,7 +245,15 @@
         <w:t xml:space="preserve">  </w:t>
       </w:r>
       <w:r>
-        <w:t>Each person in the group must have contributed to the presentation, and each member should speak equally (if possible).  During your presentation, other members of the class will be filling out a small evaluation form</w:t>
+        <w:t xml:space="preserve">Each person in the group must </w:t>
+      </w:r>
+      <w:proofErr w:type="gramStart"/>
+      <w:r>
+        <w:t>have contributed</w:t>
+      </w:r>
+      <w:proofErr w:type="gramEnd"/>
+      <w:r>
+        <w:t xml:space="preserve"> to the presentation, and each member should speak equally (if possible).  During your presentation, other members of the class will be filling out a small evaluation form</w:t>
       </w:r>
       <w:r>
         <w:t xml:space="preserve"> (found on Blackboard)</w:t>
@@ -521,7 +550,15 @@
         </w:numPr>
       </w:pPr>
       <w:r>
-        <w:t>Not contain misspellings or grammatical errors</w:t>
+        <w:t xml:space="preserve">Not </w:t>
+      </w:r>
+      <w:proofErr w:type="gramStart"/>
+      <w:r>
+        <w:t>contain</w:t>
+      </w:r>
+      <w:proofErr w:type="gramEnd"/>
+      <w:r>
+        <w:t xml:space="preserve"> misspellings or grammatical errors</w:t>
       </w:r>
     </w:p>
     <w:p>
@@ -587,11 +624,16 @@
       <w:r>
         <w:t xml:space="preserve">, but it should also contain links, screenshots of the tools, and diagrams of how things work (if applicable).  Remember to cite any sources from which you find information, and I will count </w:t>
       </w:r>
+      <w:proofErr w:type="spellStart"/>
       <w:r>
         <w:t>W</w:t>
       </w:r>
       <w:r>
-        <w:t>ikipdedia as a valid source</w:t>
+        <w:t>ikipdedia</w:t>
+      </w:r>
+      <w:proofErr w:type="spellEnd"/>
+      <w:r>
+        <w:t xml:space="preserve"> as a valid source</w:t>
       </w:r>
       <w:r>
         <w:t xml:space="preserve"> (but not an AI)</w:t>
@@ -975,7 +1017,15 @@
         <w:t xml:space="preserve"> blind</w:t>
       </w:r>
       <w:r>
-        <w:t xml:space="preserve"> attacks. Discuss how syntax of different flavors of sql can influence/thwart attacks.</w:t>
+        <w:t xml:space="preserve"> attacks. Discuss how syntax of different flavors of </w:t>
+      </w:r>
+      <w:proofErr w:type="spellStart"/>
+      <w:r>
+        <w:t>sql</w:t>
+      </w:r>
+      <w:proofErr w:type="spellEnd"/>
+      <w:r>
+        <w:t xml:space="preserve"> can influence/thwart attacks.</w:t>
       </w:r>
       <w:r>
         <w:t xml:space="preserve">  Do not assume audience has taken the database class.</w:t>
@@ -1026,8 +1076,13 @@
         <w:t xml:space="preserve">be sure to </w:t>
       </w:r>
       <w:r>
-        <w:t>discuss Nmap, Nessus, and Nikto</w:t>
-      </w:r>
+        <w:t xml:space="preserve">discuss Nmap, Nessus, and </w:t>
+      </w:r>
+      <w:proofErr w:type="spellStart"/>
+      <w:r>
+        <w:t>Nikto</w:t>
+      </w:r>
+      <w:proofErr w:type="spellEnd"/>
       <w:r>
         <w:t>.</w:t>
       </w:r>
@@ -1082,7 +1137,15 @@
         </w:numPr>
       </w:pPr>
       <w:r>
-        <w:t>Personally learn about a concept</w:t>
+        <w:t xml:space="preserve">Personally </w:t>
+      </w:r>
+      <w:proofErr w:type="gramStart"/>
+      <w:r>
+        <w:t>learn</w:t>
+      </w:r>
+      <w:proofErr w:type="gramEnd"/>
+      <w:r>
+        <w:t xml:space="preserve"> about a concept</w:t>
       </w:r>
     </w:p>
     <w:p>
@@ -1114,7 +1177,15 @@
         <w:t>Keep in mind that</w:t>
       </w:r>
       <w:r>
-        <w:t xml:space="preserve"> the purpose of this project is for you to create reference documentation for your classmates.  That means you need to learn about the tool/technique yourself and decide how best to present that information that aligns with your own style, the skill level of this class, and what the professor is expecting.  </w:t>
+        <w:t xml:space="preserve"> the purpose of this project is for you to create reference documentation for your classmates.  That means you need to learn about the tool/technique yourself and decide how best to present that </w:t>
+      </w:r>
+      <w:proofErr w:type="gramStart"/>
+      <w:r>
+        <w:t>information that</w:t>
+      </w:r>
+      <w:proofErr w:type="gramEnd"/>
+      <w:r>
+        <w:t xml:space="preserve"> aligns with your own style, the skill level of this class, and what the professor is expecting.  </w:t>
       </w:r>
       <w:r>
         <w:t>If you</w:t>
@@ -2452,6 +2523,7 @@
   <w:style w:type="character" w:default="1" w:styleId="DefaultParagraphFont">
     <w:name w:val="Default Paragraph Font"/>
     <w:uiPriority w:val="1"/>
+    <w:semiHidden/>
     <w:unhideWhenUsed/>
   </w:style>
   <w:style w:type="table" w:default="1" w:styleId="TableNormal">

</xml_diff>